<commit_message>
Update dashboard content and manuals
</commit_message>
<xml_diff>
--- a/Teacher_Student_Training_Tracker_User_Manual.docx
+++ b/Teacher_Student_Training_Tracker_User_Manual.docx
@@ -150,10 +150,7 @@
           </w:tcPr>
           <w:p>
             <w:r>
-              <w:rPr>
-                <w:sz w:val="19"/>
-              </w:rPr>
-              <w:t xml:space="preserve">Sponsor Admin</w:t>
+              <w:t>ERnet Admin</w:t>
             </w:r>
           </w:p>
         </w:tc>
@@ -464,7 +461,12 @@
         <w:pStyle w:val="Normal"/>
       </w:pPr>
       <w:r>
-        <w:t xml:space="preserve">The demo IDs and password are for demonstration only. The sign-in page also provides Open registration for users with a batch registration link and Forgot your Trainee ID? Recover it with OTP for trainee ID recovery. "Forgot password?" currently displays an informational message; it does not perform a password reset.</w:t>
+        <w:t>The demo IDs and password are for demonstration only. The sign-in page provides Click here to register. followed by the Open Registration link for users with a registration link, and Forgot your Trainee ID? Recover it with OTP for trainee ID recovery. "Forgot password?" currently displays an informational message; it does not perform a password reset.</w:t>
+      </w:r>
+    </w:p>
+    <w:p>
+      <w:r>
+        <w:t>The sign-in page presents three rotating learning stories, one at a time, changing every 30 seconds: (1) Empowering Teachers, Transforming Classrooms - One connected platform to plan training, build teaching skills, track progress, and recognize achievements through certification. (2) Every Training Session Builds a Better Tomorrow - From training plans to classroom implementation, assessments, and certification, supporting every step of a teacher's professional growth. (3) Learn. Practice. Grow. Inspire. - A unified training experience that helps teachers develop digital skills, strengthen classroom practices, and achieve measurable learning outcomes. The ERNet learning hub label is hidden.</w:t>
       </w:r>
     </w:p>
     <w:p>
@@ -488,7 +490,7 @@
         <w:pStyle w:val="Heading2"/>
       </w:pPr>
       <w:r>
-        <w:t xml:space="preserve">Sponsor Admin - Demo1</w:t>
+        <w:t>ERnet Admin - Demo1</w:t>
       </w:r>
     </w:p>
     <w:p>
@@ -544,7 +546,7 @@
         <w:pStyle w:val="Normal"/>
       </w:pPr>
       <w:r>
-        <w:t xml:space="preserve">Use this dashboard for an overall phasewise view. Sponsor Admin has Projects and MIS Reports in addition to Dashboard.</w:t>
+        <w:t>Use this dashboard for an overall phasewise view. Demo1 is labeled ERnet Admin and has Projects and MIS Reports in addition to Dashboard. The phase cards show two completed phases, one in progress, and two upcoming phases. In the current demo data, their dates are October 20, October 24, October 28, November 4, and November 10, 2026. The Attendance Report uses the same training dates as the Dashboard phases.</w:t>
       </w:r>
     </w:p>
     <w:p>
@@ -1285,10 +1287,7 @@
           </w:tcPr>
           <w:p>
             <w:r>
-              <w:rPr>
-                <w:sz w:val="19"/>
-              </w:rPr>
-              <w:t xml:space="preserve">Browse and open learning resources. Supported previews include common media and document formats supplied by the library.</w:t>
+              <w:t>Browse learning resources and switch to the Forms tab to preview available forms. Form cards show a Preview action; previews present form questions and response controls without submitting answers. Current form names are Digital Teaching Pre-assessment and Teacher Training Feedback Form. Workflow controls are not shown in this area.</w:t>
             </w:r>
           </w:p>
         </w:tc>
@@ -1369,10 +1368,7 @@
           </w:tcPr>
           <w:p>
             <w:r>
-              <w:rPr>
-                <w:sz w:val="19"/>
-              </w:rPr>
-              <w:t xml:space="preserve">Open report pages: Batch Performance, Training Summary, Attendance Report, and Feedback Report. The first three have dedicated report routes; Feedback Report is a menu link in the current interface.</w:t>
+              <w:t>Open report pages: Batch Performance, Training Summary, Attendance Report, and Feedback Report. In Assessment &amp; Feedback Report, Chart View shows question-level answer distributions with legends for answer options and an overall correct/incorrect comparison. Question cards are arranged two per row on desktop; redundant answer-count and per-question correct/incorrect charts are hidden.</w:t>
             </w:r>
           </w:p>
         </w:tc>
@@ -1425,10 +1421,7 @@
           </w:tcPr>
           <w:p>
             <w:r>
-              <w:rPr>
-                <w:sz w:val="19"/>
-              </w:rPr>
-              <w:t xml:space="preserve">Maintain trainer profiles and declared availability; profiles can include contact, competency, location, and availability details.</w:t>
+              <w:t>Maintain trainer profiles and declared availability; profiles can include contact, competency, location, and availability details. Forms Repository, Availability calendar, and Availability and assignments panels are hidden in the current screen.</w:t>
             </w:r>
           </w:p>
         </w:tc>
@@ -1531,10 +1524,7 @@
           </w:tcPr>
           <w:p>
             <w:r>
-              <w:rPr>
-                <w:sz w:val="19"/>
-              </w:rPr>
-              <w:t xml:space="preserve">Sponsor Admin</w:t>
+              <w:t>ERnet Admin</w:t>
             </w:r>
           </w:p>
         </w:tc>

</xml_diff>